<commit_message>
[REPO] Correct recovery batch numbering
</commit_message>
<xml_diff>
--- a/artifacts/docx/Batches/THREADS.docx
+++ b/artifacts/docx/Batches/THREADS.docx
@@ -85,7 +85,7 @@
     <w:p/>
     <w:p>
       <w:r>
-        <w:t>**Batches**: `A2`, `A3`, `A4`, `A16`, `A23`, `A24`, `B5`, `B25`, `B26`, `B31`, `B32`, `B33`, `B34`, `B35`, `B37`, `B38`, `B40`, `B41`, `B42`, `B44`, `B47`, `B50`, `C8`, `C9`, `C11`, `C14`, `C18`, `C29`, `C67`, `C68`, `C69`, `C70`, `C71`, `C75`, `C77`, `C82`, `C83`, `C84`, `C85`, `C86`, `C87`, `C88`, `C89`, `C93`, `C94`, `C95`, `C96`, `C97`, `C98`, `C99`, `C100`, `C101`, `C102`, `C103`, `C104`, `C105`, `C106`, `C107`, `C108`, `C116`, `C117`, `C118`, `C121`, `C122`, `C123`, `C124`, `C125`, `C126`, `C130`</w:t>
+        <w:t>**Batches**: `A2`, `A3`, `A4`, `A16`, `A23`, `A24`, `B5`, `B25`, `B26`, `B31`, `B32`, `B33`, `B34`, `B35`, `B37`, `B38`, `B40`, `B41`, `B42`, `B44`, `B47`, `B50`, `C8`, `C9`, `C11`, `C14`, `C18`, `C29`, `C67`, `C68`, `C69`, `C70`, `C71`, `C75`, `C77`, `C82`, `C83`, `C84`, `C85`, `C86`, `C87`, `C88`, `C89`, `C93`, `C94`, `C95`, `C96`, `C97`, `C98`, `C99`, `C100`, `C101`, `C102`, `C103`, `C104`, `C105`, `C106`, `C107`, `C108`, `C116`, `C117`, `C118`, `C121`, `C122`, `C123`, `C124`, `C125`, `C126`, `C127`</w:t>
       </w:r>
     </w:p>
     <w:p/>
@@ -112,7 +112,7 @@
     <w:p/>
     <w:p>
       <w:r>
-        <w:t>**Batches**: `A23`, `C6`, `C16`, `C65`, `C66`, `C69`, `C77`, `C126`, `C130`</w:t>
+        <w:t>**Batches**: `A23`, `C6`, `C16`, `C65`, `C66`, `C69`, `C77`, `C126`, `C127`</w:t>
       </w:r>
     </w:p>
     <w:p/>
@@ -229,7 +229,7 @@
     <w:p/>
     <w:p>
       <w:r>
-        <w:t>**Batches**: `A7`, `A17`, `A18`, `A19`, `B28`, `B37`, `B38`, `B48`, `C9`, `C16`, `C17`, `C20`, `C21`, `C29`, `C30`, `C31`, `C32`, `C33`, `C34`, `C35`, `C39`, `C40`, `C41`, `C45`, `C46`, `C62`, `C63`, `C65`, `C66`, `C73`, `C75`, `C112`, `C113`, `C119`, `C123`, `C126`, `C130`</w:t>
+        <w:t>**Batches**: `A7`, `A17`, `A18`, `A19`, `B28`, `B37`, `B38`, `B48`, `C9`, `C16`, `C17`, `C20`, `C21`, `C29`, `C30`, `C31`, `C32`, `C33`, `C34`, `C35`, `C39`, `C40`, `C41`, `C45`, `C46`, `C62`, `C63`, `C65`, `C66`, `C73`, `C75`, `C112`, `C113`, `C119`, `C123`, `C126`, `C127`</w:t>
       </w:r>
     </w:p>
     <w:p/>

</xml_diff>

<commit_message>
[REPO] Correct recovery batch numbering (#68)
</commit_message>
<xml_diff>
--- a/artifacts/docx/Batches/THREADS.docx
+++ b/artifacts/docx/Batches/THREADS.docx
@@ -85,7 +85,7 @@
     <w:p/>
     <w:p>
       <w:r>
-        <w:t>**Batches**: `A2`, `A3`, `A4`, `A16`, `A23`, `A24`, `B5`, `B25`, `B26`, `B31`, `B32`, `B33`, `B34`, `B35`, `B37`, `B38`, `B40`, `B41`, `B42`, `B44`, `B47`, `B50`, `C8`, `C9`, `C11`, `C14`, `C18`, `C29`, `C67`, `C68`, `C69`, `C70`, `C71`, `C75`, `C77`, `C82`, `C83`, `C84`, `C85`, `C86`, `C87`, `C88`, `C89`, `C93`, `C94`, `C95`, `C96`, `C97`, `C98`, `C99`, `C100`, `C101`, `C102`, `C103`, `C104`, `C105`, `C106`, `C107`, `C108`, `C116`, `C117`, `C118`, `C121`, `C122`, `C123`, `C124`, `C125`, `C126`, `C130`</w:t>
+        <w:t>**Batches**: `A2`, `A3`, `A4`, `A16`, `A23`, `A24`, `B5`, `B25`, `B26`, `B31`, `B32`, `B33`, `B34`, `B35`, `B37`, `B38`, `B40`, `B41`, `B42`, `B44`, `B47`, `B50`, `C8`, `C9`, `C11`, `C14`, `C18`, `C29`, `C67`, `C68`, `C69`, `C70`, `C71`, `C75`, `C77`, `C82`, `C83`, `C84`, `C85`, `C86`, `C87`, `C88`, `C89`, `C93`, `C94`, `C95`, `C96`, `C97`, `C98`, `C99`, `C100`, `C101`, `C102`, `C103`, `C104`, `C105`, `C106`, `C107`, `C108`, `C116`, `C117`, `C118`, `C121`, `C122`, `C123`, `C124`, `C125`, `C126`, `C127`</w:t>
       </w:r>
     </w:p>
     <w:p/>
@@ -112,7 +112,7 @@
     <w:p/>
     <w:p>
       <w:r>
-        <w:t>**Batches**: `A23`, `C6`, `C16`, `C65`, `C66`, `C69`, `C77`, `C126`, `C130`</w:t>
+        <w:t>**Batches**: `A23`, `C6`, `C16`, `C65`, `C66`, `C69`, `C77`, `C126`, `C127`</w:t>
       </w:r>
     </w:p>
     <w:p/>
@@ -229,7 +229,7 @@
     <w:p/>
     <w:p>
       <w:r>
-        <w:t>**Batches**: `A7`, `A17`, `A18`, `A19`, `B28`, `B37`, `B38`, `B48`, `C9`, `C16`, `C17`, `C20`, `C21`, `C29`, `C30`, `C31`, `C32`, `C33`, `C34`, `C35`, `C39`, `C40`, `C41`, `C45`, `C46`, `C62`, `C63`, `C65`, `C66`, `C73`, `C75`, `C112`, `C113`, `C119`, `C123`, `C126`, `C130`</w:t>
+        <w:t>**Batches**: `A7`, `A17`, `A18`, `A19`, `B28`, `B37`, `B38`, `B48`, `C9`, `C16`, `C17`, `C20`, `C21`, `C29`, `C30`, `C31`, `C32`, `C33`, `C34`, `C35`, `C39`, `C40`, `C41`, `C45`, `C46`, `C62`, `C63`, `C65`, `C66`, `C73`, `C75`, `C112`, `C113`, `C119`, `C123`, `C126`, `C127`</w:t>
       </w:r>
     </w:p>
     <w:p/>

</xml_diff>